<commit_message>
Add YouTube and LinkedIn links; remove files not required by the assignment
</commit_message>
<xml_diff>
--- a/docs/BLAST01-Report.docx
+++ b/docs/BLAST01-Report.docx
@@ -5,7 +5,6 @@
     <w:p>
       <w:pPr>
         <w:pStyle w:val="Title"/>
-        <w:jc w:val="left"/>
       </w:pPr>
       <w:r>
         <w:rPr>
@@ -235,7 +234,7 @@
             </w:tcMar>
           </w:tcPr>
           <w:p>
-            <w:hyperlink w:history="1" r:id="rIdcjmtl36smvjtx2ylg-nzh">
+            <w:hyperlink w:history="1" r:id="rIdostj14dk9xgrx4w_wnihp">
               <w:r>
                 <w:rPr>
                   <w:rStyle w:val="Hyperlink"/>
@@ -297,16 +296,17 @@
             </w:tcMar>
           </w:tcPr>
           <w:p>
-            <w:r>
-              <w:rPr>
-                <w:rFonts w:ascii="Calibri" w:cs="Calibri" w:eastAsia="Calibri" w:hAnsi="Calibri"/>
-                <w:i/>
-                <w:iCs/>
-                <w:sz w:val="19"/>
-                <w:szCs w:val="19"/>
-              </w:rPr>
-              <w:t xml:space="preserve">(add after upload)</w:t>
-            </w:r>
+            <w:hyperlink w:history="1" r:id="rIddg60gwlzb9j0cysxblgcp">
+              <w:r>
+                <w:rPr>
+                  <w:rStyle w:val="Hyperlink"/>
+                  <w:rFonts w:ascii="Calibri" w:cs="Calibri" w:eastAsia="Calibri" w:hAnsi="Calibri"/>
+                  <w:sz w:val="19"/>
+                  <w:szCs w:val="19"/>
+                </w:rPr>
+                <w:t xml:space="preserve">https://youtu.be/BAbp8Kh--b8</w:t>
+              </w:r>
+            </w:hyperlink>
           </w:p>
         </w:tc>
       </w:tr>
@@ -358,16 +358,17 @@
             </w:tcMar>
           </w:tcPr>
           <w:p>
-            <w:r>
-              <w:rPr>
-                <w:rFonts w:ascii="Calibri" w:cs="Calibri" w:eastAsia="Calibri" w:hAnsi="Calibri"/>
-                <w:i/>
-                <w:iCs/>
-                <w:sz w:val="19"/>
-                <w:szCs w:val="19"/>
-              </w:rPr>
-              <w:t xml:space="preserve">(add after posting)</w:t>
-            </w:r>
+            <w:hyperlink w:history="1" r:id="rIdk7-esxupparyfrt63zjfm">
+              <w:r>
+                <w:rPr>
+                  <w:rStyle w:val="Hyperlink"/>
+                  <w:rFonts w:ascii="Calibri" w:cs="Calibri" w:eastAsia="Calibri" w:hAnsi="Calibri"/>
+                  <w:sz w:val="19"/>
+                  <w:szCs w:val="19"/>
+                </w:rPr>
+                <w:t xml:space="preserve">https://lnkd.in/p/gnaGYeny</w:t>
+              </w:r>
+            </w:hyperlink>
           </w:p>
         </w:tc>
       </w:tr>
@@ -1541,7 +1542,7 @@
                     </pic:cNvPicPr>
                   </pic:nvPicPr>
                   <pic:blipFill>
-                    <a:blip r:embed="rId8" cstate="none"/>
+                    <a:blip r:embed="rId21" cstate="none"/>
                     <a:srcRect/>
                     <a:stretch>
                       <a:fillRect/>
@@ -1664,7 +1665,7 @@
                     </pic:cNvPicPr>
                   </pic:nvPicPr>
                   <pic:blipFill>
-                    <a:blip r:embed="rId9" cstate="none"/>
+                    <a:blip r:embed="rId22" cstate="none"/>
                     <a:srcRect/>
                     <a:stretch>
                       <a:fillRect/>
@@ -2448,7 +2449,7 @@
                     </pic:cNvPicPr>
                   </pic:nvPicPr>
                   <pic:blipFill>
-                    <a:blip r:embed="rId10" cstate="none"/>
+                    <a:blip r:embed="rId23" cstate="none"/>
                     <a:srcRect/>
                     <a:stretch>
                       <a:fillRect/>
@@ -2684,7 +2685,7 @@
                     </pic:cNvPicPr>
                   </pic:nvPicPr>
                   <pic:blipFill>
-                    <a:blip r:embed="rId11" cstate="none"/>
+                    <a:blip r:embed="rId24" cstate="none"/>
                     <a:srcRect/>
                     <a:stretch>
                       <a:fillRect/>
@@ -2920,7 +2921,7 @@
                     </pic:cNvPicPr>
                   </pic:nvPicPr>
                   <pic:blipFill>
-                    <a:blip r:embed="rId12" cstate="none"/>
+                    <a:blip r:embed="rId25" cstate="none"/>
                     <a:srcRect/>
                     <a:stretch>
                       <a:fillRect/>
@@ -3142,8 +3143,6 @@
       <w:r>
         <w:rPr>
           <w:rFonts w:ascii="Calibri" w:cs="Calibri" w:eastAsia="Calibri" w:hAnsi="Calibri"/>
-          <w:i w:val="false"/>
-          <w:iCs w:val="false"/>
           <w:sz w:val="22"/>
           <w:szCs w:val="22"/>
         </w:rPr>
@@ -3162,8 +3161,6 @@
       <w:r>
         <w:rPr>
           <w:rFonts w:ascii="Calibri" w:cs="Calibri" w:eastAsia="Calibri" w:hAnsi="Calibri"/>
-          <w:i w:val="false"/>
-          <w:iCs w:val="false"/>
           <w:sz w:val="22"/>
           <w:szCs w:val="22"/>
         </w:rPr>
@@ -3182,8 +3179,6 @@
       <w:r>
         <w:rPr>
           <w:rFonts w:ascii="Calibri" w:cs="Calibri" w:eastAsia="Calibri" w:hAnsi="Calibri"/>
-          <w:i w:val="false"/>
-          <w:iCs w:val="false"/>
           <w:sz w:val="22"/>
           <w:szCs w:val="22"/>
         </w:rPr>
@@ -3202,8 +3197,6 @@
       <w:r>
         <w:rPr>
           <w:rFonts w:ascii="Calibri" w:cs="Calibri" w:eastAsia="Calibri" w:hAnsi="Calibri"/>
-          <w:i w:val="false"/>
-          <w:iCs w:val="false"/>
           <w:sz w:val="22"/>
           <w:szCs w:val="22"/>
         </w:rPr>
@@ -3222,8 +3215,6 @@
       <w:r>
         <w:rPr>
           <w:rFonts w:ascii="Calibri" w:cs="Calibri" w:eastAsia="Calibri" w:hAnsi="Calibri"/>
-          <w:i w:val="false"/>
-          <w:iCs w:val="false"/>
           <w:sz w:val="22"/>
           <w:szCs w:val="22"/>
         </w:rPr>
@@ -7053,7 +7044,7 @@
                     </pic:cNvPicPr>
                   </pic:nvPicPr>
                   <pic:blipFill>
-                    <a:blip r:embed="rId13" cstate="none"/>
+                    <a:blip r:embed="rId26" cstate="none"/>
                     <a:srcRect/>
                     <a:stretch>
                       <a:fillRect/>
@@ -8911,7 +8902,7 @@
     <w:p>
       <w:pPr>
         <w:shd w:fill="F3F5F8" w:color="auto" w:val="clear"/>
-        <w:spacing w:after="0" w:before="0"/>
+        <w:spacing w:after="160" w:before="0"/>
       </w:pPr>
       <w:r>
         <w:rPr>
@@ -8920,20 +8911,6 @@
           <w:szCs w:val="18"/>
         </w:rPr>
         <w:t xml:space="preserve">src/      CloudRecord.cpp BPlusTree.cpp CloudIndexApp.cpp InputUtils.cpp  main.cpp</w:t>
-      </w:r>
-    </w:p>
-    <w:p>
-      <w:pPr>
-        <w:shd w:fill="F3F5F8" w:color="auto" w:val="clear"/>
-        <w:spacing w:after="160" w:before="0"/>
-      </w:pPr>
-      <w:r>
-        <w:rPr>
-          <w:rFonts w:ascii="Consolas" w:cs="Consolas" w:eastAsia="Consolas" w:hAnsi="Consolas"/>
-          <w:sz w:val="18"/>
-          <w:szCs w:val="18"/>
-        </w:rPr>
-        <w:t xml:space="preserve">tests/    test_bplustree.cpp</w:t>
       </w:r>
     </w:p>
     <w:p>
@@ -9196,7 +9173,7 @@
                     </pic:cNvPicPr>
                   </pic:nvPicPr>
                   <pic:blipFill>
-                    <a:blip r:embed="rId14" cstate="none"/>
+                    <a:blip r:embed="rId27" cstate="none"/>
                     <a:srcRect/>
                     <a:stretch>
                       <a:fillRect/>
@@ -9259,7 +9236,7 @@
                     </pic:cNvPicPr>
                   </pic:nvPicPr>
                   <pic:blipFill>
-                    <a:blip r:embed="rId15" cstate="none"/>
+                    <a:blip r:embed="rId28" cstate="none"/>
                     <a:srcRect/>
                     <a:stretch>
                       <a:fillRect/>
@@ -10181,15 +10158,15 @@
           <w:sz w:val="22"/>
           <w:szCs w:val="22"/>
         </w:rPr>
-        <w:t xml:space="preserve">Automated tests</w:t>
-      </w:r>
-      <w:r>
-        <w:rPr>
-          <w:rFonts w:ascii="Calibri" w:cs="Calibri" w:eastAsia="Calibri" w:hAnsi="Calibri"/>
-          <w:sz w:val="22"/>
-          <w:szCs w:val="22"/>
-        </w:rPr>
-        <w:t xml:space="preserve"> (</w:t>
+        <w:t xml:space="preserve">Self-check.</w:t>
+      </w:r>
+      <w:r>
+        <w:rPr>
+          <w:rFonts w:ascii="Calibri" w:cs="Calibri" w:eastAsia="Calibri" w:hAnsi="Calibri"/>
+          <w:sz w:val="22"/>
+          <w:szCs w:val="22"/>
+        </w:rPr>
+        <w:t xml:space="preserve"> The tree's </w:t>
       </w:r>
       <w:r>
         <w:rPr>
@@ -10197,56 +10174,6 @@
           <w:sz w:val="20"/>
           <w:szCs w:val="20"/>
         </w:rPr>
-        <w:t xml:space="preserve">make test</w:t>
-      </w:r>
-      <w:r>
-        <w:rPr>
-          <w:rFonts w:ascii="Calibri" w:cs="Calibri" w:eastAsia="Calibri" w:hAnsi="Calibri"/>
-          <w:sz w:val="22"/>
-          <w:szCs w:val="22"/>
-        </w:rPr>
-        <w:t xml:space="preserve">). Every operation is mirrored in </w:t>
-      </w:r>
-      <w:r>
-        <w:rPr>
-          <w:rFonts w:ascii="Consolas" w:cs="Consolas" w:eastAsia="Consolas" w:hAnsi="Consolas"/>
-          <w:sz w:val="20"/>
-          <w:szCs w:val="20"/>
-        </w:rPr>
-        <w:t xml:space="preserve">std::map</w:t>
-      </w:r>
-      <w:r>
-        <w:rPr>
-          <w:rFonts w:ascii="Calibri" w:cs="Calibri" w:eastAsia="Calibri" w:hAnsi="Calibri"/>
-          <w:sz w:val="22"/>
-          <w:szCs w:val="22"/>
-        </w:rPr>
-        <w:t xml:space="preserve"> as a reference answer, for orders 3–9 and 64, with 4,000 random inserts, deletes and searches per run. After </w:t>
-      </w:r>
-      <w:r>
-        <w:rPr>
-          <w:rFonts w:ascii="Calibri" w:cs="Calibri" w:eastAsia="Calibri" w:hAnsi="Calibri"/>
-          <w:b/>
-          <w:bCs/>
-          <w:sz w:val="22"/>
-          <w:szCs w:val="22"/>
-        </w:rPr>
-        <w:t xml:space="preserve">every</w:t>
-      </w:r>
-      <w:r>
-        <w:rPr>
-          <w:rFonts w:ascii="Calibri" w:cs="Calibri" w:eastAsia="Calibri" w:hAnsi="Calibri"/>
-          <w:sz w:val="22"/>
-          <w:szCs w:val="22"/>
-        </w:rPr>
-        <w:t xml:space="preserve"> operation the tree's </w:t>
-      </w:r>
-      <w:r>
-        <w:rPr>
-          <w:rFonts w:ascii="Consolas" w:cs="Consolas" w:eastAsia="Consolas" w:hAnsi="Consolas"/>
-          <w:sz w:val="20"/>
-          <w:szCs w:val="20"/>
-        </w:rPr>
         <w:t xml:space="preserve">validate()</w:t>
       </w:r>
       <w:r>
@@ -10255,23 +10182,7 @@
           <w:sz w:val="22"/>
           <w:szCs w:val="22"/>
         </w:rPr>
-        <w:t xml:space="preserve"> checks sorted keys, fill limits, child counts, equal leaf depth, subtree key ranges, and the leaf chain. All checks pass (</w:t>
-      </w:r>
-      <w:r>
-        <w:rPr>
-          <w:rFonts w:ascii="Consolas" w:cs="Consolas" w:eastAsia="Consolas" w:hAnsi="Consolas"/>
-          <w:sz w:val="20"/>
-          <w:szCs w:val="20"/>
-        </w:rPr>
-        <w:t xml:space="preserve">docs/test-output.txt</w:t>
-      </w:r>
-      <w:r>
-        <w:rPr>
-          <w:rFonts w:ascii="Calibri" w:cs="Calibri" w:eastAsia="Calibri" w:hAnsi="Calibri"/>
-          <w:sz w:val="22"/>
-          <w:szCs w:val="22"/>
-        </w:rPr>
-        <w:t xml:space="preserve">).</w:t>
+        <w:t xml:space="preserve"> method checks sorted keys, fill limits, child counts, equal leaf depth, subtree key ranges, and the leaf chain. Menu option 9 runs it on the live index, and it reports PASSED after every sequence of splits, merges and borrows in the sample run.</w:t>
       </w:r>
     </w:p>
     <w:p>
@@ -10291,15 +10202,15 @@
           <w:sz w:val="22"/>
           <w:szCs w:val="22"/>
         </w:rPr>
-        <w:t xml:space="preserve">Scripted demonstration</w:t>
-      </w:r>
-      <w:r>
-        <w:rPr>
-          <w:rFonts w:ascii="Calibri" w:cs="Calibri" w:eastAsia="Calibri" w:hAnsi="Calibri"/>
-          <w:sz w:val="22"/>
-          <w:szCs w:val="22"/>
-        </w:rPr>
-        <w:t xml:space="preserve"> (</w:t>
+        <w:t xml:space="preserve">Stress testing during development.</w:t>
+      </w:r>
+      <w:r>
+        <w:rPr>
+          <w:rFonts w:ascii="Calibri" w:cs="Calibri" w:eastAsia="Calibri" w:hAnsi="Calibri"/>
+          <w:sz w:val="22"/>
+          <w:szCs w:val="22"/>
+        </w:rPr>
+        <w:t xml:space="preserve"> Every operation was mirrored in </w:t>
       </w:r>
       <w:r>
         <w:rPr>
@@ -10307,15 +10218,15 @@
           <w:sz w:val="20"/>
           <w:szCs w:val="20"/>
         </w:rPr>
-        <w:t xml:space="preserve">make demo</w:t>
-      </w:r>
-      <w:r>
-        <w:rPr>
-          <w:rFonts w:ascii="Calibri" w:cs="Calibri" w:eastAsia="Calibri" w:hAnsi="Calibri"/>
-          <w:sz w:val="22"/>
-          <w:szCs w:val="22"/>
-        </w:rPr>
-        <w:t xml:space="preserve">). It feeds </w:t>
+        <w:t xml:space="preserve">std::map</w:t>
+      </w:r>
+      <w:r>
+        <w:rPr>
+          <w:rFonts w:ascii="Calibri" w:cs="Calibri" w:eastAsia="Calibri" w:hAnsi="Calibri"/>
+          <w:sz w:val="22"/>
+          <w:szCs w:val="22"/>
+        </w:rPr>
+        <w:t xml:space="preserve"> as a reference answer, for orders 3–9 and 64, with 4,000 random inserts, deletes and searches per run, and </w:t>
       </w:r>
       <w:r>
         <w:rPr>
@@ -10323,15 +10234,43 @@
           <w:sz w:val="20"/>
           <w:szCs w:val="20"/>
         </w:rPr>
-        <w:t xml:space="preserve">docs/demo-input.txt</w:t>
-      </w:r>
-      <w:r>
-        <w:rPr>
-          <w:rFonts w:ascii="Calibri" w:cs="Calibri" w:eastAsia="Calibri" w:hAnsi="Calibri"/>
-          <w:sz w:val="22"/>
-          <w:szCs w:val="22"/>
-        </w:rPr>
-        <w:t xml:space="preserve"> to the program. The full output is in </w:t>
+        <w:t xml:space="preserve">validate()</w:t>
+      </w:r>
+      <w:r>
+        <w:rPr>
+          <w:rFonts w:ascii="Calibri" w:cs="Calibri" w:eastAsia="Calibri" w:hAnsi="Calibri"/>
+          <w:sz w:val="22"/>
+          <w:szCs w:val="22"/>
+        </w:rPr>
+        <w:t xml:space="preserve"> re-run after every operation. All checks passed.</w:t>
+      </w:r>
+    </w:p>
+    <w:p>
+      <w:pPr>
+        <w:pStyle w:val="ListParagraph"/>
+        <w:numPr>
+          <w:ilvl w:val="0"/>
+          <w:numId w:val="5"/>
+        </w:numPr>
+        <w:spacing w:after="60"/>
+      </w:pPr>
+      <w:r>
+        <w:rPr>
+          <w:rFonts w:ascii="Calibri" w:cs="Calibri" w:eastAsia="Calibri" w:hAnsi="Calibri"/>
+          <w:b/>
+          <w:bCs/>
+          <w:sz w:val="22"/>
+          <w:szCs w:val="22"/>
+        </w:rPr>
+        <w:t xml:space="preserve">Sample run.</w:t>
+      </w:r>
+      <w:r>
+        <w:rPr>
+          <w:rFonts w:ascii="Calibri" w:cs="Calibri" w:eastAsia="Calibri" w:hAnsi="Calibri"/>
+          <w:sz w:val="22"/>
+          <w:szCs w:val="22"/>
+        </w:rPr>
+        <w:t xml:space="preserve"> The full output of a sample session is in </w:t>
       </w:r>
       <w:r>
         <w:rPr>
@@ -10408,7 +10347,7 @@
                     </pic:cNvPicPr>
                   </pic:nvPicPr>
                   <pic:blipFill>
-                    <a:blip r:embed="rId16" cstate="none"/>
+                    <a:blip r:embed="rId29" cstate="none"/>
                     <a:srcRect/>
                     <a:stretch>
                       <a:fillRect/>
@@ -10529,7 +10468,7 @@
         </w:rPr>
         <w:t xml:space="preserve">(3), 173–189. </w:t>
       </w:r>
-      <w:hyperlink w:history="1" r:id="rIdztgstywlw5_bkexhnru_-">
+      <w:hyperlink w:history="1" r:id="rIdjhh_r6i-hi0l__tunf8xg">
         <w:r>
           <w:rPr>
             <w:rStyle w:val="Hyperlink"/>
@@ -10572,7 +10511,7 @@
         </w:rPr>
         <w:t xml:space="preserve">(2), 121–137. </w:t>
       </w:r>
-      <w:hyperlink w:history="1" r:id="rIdb_hzbsh6tgtfyvud1bsdn">
+      <w:hyperlink w:history="1" r:id="rIdwv6jhjj6zpa0hu9pqysqw">
         <w:r>
           <w:rPr>
             <w:rStyle w:val="Hyperlink"/>
@@ -10647,7 +10586,7 @@
         </w:rPr>
         <w:t xml:space="preserve"> (pp. 1037–1048). </w:t>
       </w:r>
-      <w:hyperlink w:history="1" r:id="rIdkfv1iel_rxhng2l5mdlzs">
+      <w:hyperlink w:history="1" r:id="rIdawrg-smozwiwfca4wxgql">
         <w:r>
           <w:rPr>
             <w:rStyle w:val="Hyperlink"/>
@@ -10690,7 +10629,7 @@
         </w:rPr>
         <w:t xml:space="preserve">(4), 650–670. </w:t>
       </w:r>
-      <w:hyperlink w:history="1" r:id="rIddmkpvk_olwg0kpghnpspf">
+      <w:hyperlink w:history="1" r:id="rId0yddmdepgxsy4fp94nndo">
         <w:r>
           <w:rPr>
             <w:rStyle w:val="Hyperlink"/>
@@ -10733,7 +10672,7 @@
         </w:rPr>
         <w:t xml:space="preserve">. Microsoft Learn. </w:t>
       </w:r>
-      <w:hyperlink w:history="1" r:id="rIdfcfasmp152grjuj7ychyd">
+      <w:hyperlink w:history="1" r:id="rIdwjsadth7kdfxuov6xipss">
         <w:r>
           <w:rPr>
             <w:rStyle w:val="Hyperlink"/>
@@ -10776,7 +10715,7 @@
         </w:rPr>
         <w:t xml:space="preserve">. MySQL 8.0 Reference Manual. </w:t>
       </w:r>
-      <w:hyperlink w:history="1" r:id="rIdy4pneoqevdhkqiswa_yzn">
+      <w:hyperlink w:history="1" r:id="rIdloiadcgulm9uzyqksaird">
         <w:r>
           <w:rPr>
             <w:rStyle w:val="Hyperlink"/>
@@ -10819,7 +10758,7 @@
         </w:rPr>
         <w:t xml:space="preserve">. PostgreSQL Documentation. </w:t>
       </w:r>
-      <w:hyperlink w:history="1" r:id="rIdikp5wtwu4tkx1p9k5z07k">
+      <w:hyperlink w:history="1" r:id="rIdstffaz9ho6y0nqwohqm0w">
         <w:r>
           <w:rPr>
             <w:rStyle w:val="Hyperlink"/>
@@ -10862,7 +10801,7 @@
         </w:rPr>
         <w:t xml:space="preserve">(3), 1–32. </w:t>
       </w:r>
-      <w:hyperlink w:history="1" r:id="rIdwvh9yzctbxuxbafbakxdx">
+      <w:hyperlink w:history="1" r:id="rIdbgzsixi9l4xzlbcd49vqm">
         <w:r>
           <w:rPr>
             <w:rStyle w:val="Hyperlink"/>
@@ -10905,7 +10844,7 @@
         </w:rPr>
         <w:t xml:space="preserve">. </w:t>
       </w:r>
-      <w:hyperlink w:history="1" r:id="rIddkhqob6p6209za9eozwsk">
+      <w:hyperlink w:history="1" r:id="rIdafpsgp7jpyduzfvurzixb">
         <w:r>
           <w:rPr>
             <w:rStyle w:val="Hyperlink"/>
@@ -10948,7 +10887,7 @@
         </w:rPr>
         <w:t xml:space="preserve"> (pp. 1041–1052). </w:t>
       </w:r>
-      <w:hyperlink w:history="1" r:id="rIduuyvipefhlzmkjxq9wu0k">
+      <w:hyperlink w:history="1" r:id="rId2bv3wu0s98gueoxunrrfy">
         <w:r>
           <w:rPr>
             <w:rStyle w:val="Hyperlink"/>
@@ -11029,8 +10968,29 @@
         <w:szCs w:val="16"/>
       </w:rPr>
       <w:fldChar w:fldCharType="begin"/>
+    </w:r>
+    <w:r>
+      <w:rPr>
+        <w:color w:val="5B6B7C"/>
+        <w:sz w:val="16"/>
+        <w:szCs w:val="16"/>
+      </w:rPr>
       <w:instrText xml:space="preserve">PAGE</w:instrText>
+    </w:r>
+    <w:r>
+      <w:rPr>
+        <w:color w:val="5B6B7C"/>
+        <w:sz w:val="16"/>
+        <w:szCs w:val="16"/>
+      </w:rPr>
       <w:fldChar w:fldCharType="separate"/>
+    </w:r>
+    <w:r>
+      <w:rPr>
+        <w:color w:val="5B6B7C"/>
+        <w:sz w:val="16"/>
+        <w:szCs w:val="16"/>
+      </w:rPr>
       <w:fldChar w:fldCharType="end"/>
     </w:r>
   </w:p>
@@ -11292,6 +11252,21 @@
   <w:style w:type="paragraph" w:styleId="Normal" w:default="1">
     <w:name w:val="Normal"/>
     <w:qFormat/>
+  </w:style>
+  <w:style w:type="table" w:styleId="TableNormal" w:default="true">
+    <w:name w:val="Normal Table"/>
+    <w:uiPriority w:val="99"/>
+    <w:semiHidden/>
+    <w:unhideWhenUsed/>
+    <w:tblPr>
+      <w:tblInd w:type="dxa" w:w="0"/>
+      <w:tblCellMar>
+        <w:top w:type="dxa" w:w="0"/>
+        <w:left w:type="dxa" w:w="108"/>
+        <w:bottom w:type="dxa" w:w="0"/>
+        <w:right w:type="dxa" w:w="108"/>
+      </w:tblCellMar>
+    </w:tblPr>
   </w:style>
   <w:style w:type="paragraph" w:styleId="Heading3">
     <w:name w:val="Heading 3"/>

</xml_diff>